<commit_message>
Subir el margen al 50 % en las cotizaciones internas y en la de Tyler
Co-Authored-By: Claude Opus 5.5 <noreply@anthropic.com>
Claude-Session: https://claude.ai/code/session_0137o8WSxNvVuvENWjtHj8Xx
</commit_message>
<xml_diff>
--- a/cotizaciones/Estimate_Yellowstone_Club_Stone_Floor.docx
+++ b/cotizaciones/Estimate_Yellowstone_Club_Stone_Floor.docx
@@ -608,7 +608,7 @@
                 <w:sz w:val="24"/>
                 <w:szCs w:val="24"/>
               </w:rPr>
-              <w:t xml:space="preserve">$7,915</w:t>
+              <w:t xml:space="preserve">$10,290</w:t>
             </w:r>
           </w:p>
         </w:tc>
@@ -643,7 +643,7 @@
                 <w:sz w:val="21"/>
                 <w:szCs w:val="21"/>
               </w:rPr>
-              <w:t xml:space="preserve">+$1,735</w:t>
+              <w:t xml:space="preserve">+$2,260</w:t>
             </w:r>
           </w:p>
         </w:tc>
@@ -775,7 +775,7 @@
                 <w:sz w:val="24"/>
                 <w:szCs w:val="24"/>
               </w:rPr>
-              <w:t xml:space="preserve">$6,375</w:t>
+              <w:t xml:space="preserve">$8,285</w:t>
             </w:r>
           </w:p>
         </w:tc>
@@ -809,7 +809,7 @@
                 <w:sz w:val="21"/>
                 <w:szCs w:val="21"/>
               </w:rPr>
-              <w:t xml:space="preserve">+$195</w:t>
+              <w:t xml:space="preserve">+$255</w:t>
             </w:r>
           </w:p>
         </w:tc>
@@ -941,7 +941,7 @@
                 <w:sz w:val="24"/>
                 <w:szCs w:val="24"/>
               </w:rPr>
-              <w:t xml:space="preserve">$6,820</w:t>
+              <w:t xml:space="preserve">$8,860</w:t>
             </w:r>
           </w:p>
         </w:tc>
@@ -975,7 +975,7 @@
                 <w:sz w:val="21"/>
                 <w:szCs w:val="21"/>
               </w:rPr>
-              <w:t xml:space="preserve">+$640</w:t>
+              <w:t xml:space="preserve">+$830</w:t>
             </w:r>
           </w:p>
         </w:tc>
@@ -1107,7 +1107,7 @@
                 <w:sz w:val="24"/>
                 <w:szCs w:val="24"/>
               </w:rPr>
-              <w:t xml:space="preserve">$6,180</w:t>
+              <w:t xml:space="preserve">$8,030</w:t>
             </w:r>
           </w:p>
         </w:tc>
@@ -1202,7 +1202,7 @@
           <w:sz w:val="21"/>
           <w:szCs w:val="21"/>
         </w:rPr>
-        <w:t xml:space="preserve">$6,180 – $7,915. </w:t>
+        <w:t xml:space="preserve">$8,030 – $10,290. </w:t>
       </w:r>
       <w:r>
         <w:rPr>
@@ -1220,7 +1220,7 @@
           <w:sz w:val="21"/>
           <w:szCs w:val="21"/>
         </w:rPr>
-        <w:t xml:space="preserve">$1,735</w:t>
+        <w:t xml:space="preserve">$2,260</w:t>
       </w:r>
       <w:r>
         <w:rPr>
@@ -1507,7 +1507,7 @@
                 <w:sz w:val="21"/>
                 <w:szCs w:val="21"/>
               </w:rPr>
-              <w:t xml:space="preserve">$6,180</w:t>
+              <w:t xml:space="preserve">$8,030</w:t>
             </w:r>
           </w:p>
         </w:tc>
@@ -1603,7 +1603,7 @@
                 <w:sz w:val="21"/>
                 <w:szCs w:val="21"/>
               </w:rPr>
-              <w:t xml:space="preserve">−$1,735</w:t>
+              <w:t xml:space="preserve">−$2,260</w:t>
             </w:r>
           </w:p>
         </w:tc>
@@ -1682,7 +1682,7 @@
                 <w:sz w:val="21"/>
                 <w:szCs w:val="21"/>
               </w:rPr>
-              <w:t xml:space="preserve">$6,375</w:t>
+              <w:t xml:space="preserve">$8,285</w:t>
             </w:r>
           </w:p>
         </w:tc>
@@ -1715,7 +1715,7 @@
                 <w:sz w:val="21"/>
                 <w:szCs w:val="21"/>
               </w:rPr>
-              <w:t xml:space="preserve">+$195</w:t>
+              <w:t xml:space="preserve">+$255</w:t>
             </w:r>
           </w:p>
         </w:tc>
@@ -1748,7 +1748,7 @@
                 <w:sz w:val="21"/>
                 <w:szCs w:val="21"/>
               </w:rPr>
-              <w:t xml:space="preserve">+$195</w:t>
+              <w:t xml:space="preserve">+$255</w:t>
             </w:r>
           </w:p>
         </w:tc>
@@ -1781,7 +1781,7 @@
                 <w:sz w:val="21"/>
                 <w:szCs w:val="21"/>
               </w:rPr>
-              <w:t xml:space="preserve">−$1,540</w:t>
+              <w:t xml:space="preserve">−$2,005</w:t>
             </w:r>
           </w:p>
         </w:tc>
@@ -1858,7 +1858,7 @@
                 <w:sz w:val="21"/>
                 <w:szCs w:val="21"/>
               </w:rPr>
-              <w:t xml:space="preserve">$6,820</w:t>
+              <w:t xml:space="preserve">$8,860</w:t>
             </w:r>
           </w:p>
         </w:tc>
@@ -1890,7 +1890,7 @@
                 <w:sz w:val="21"/>
                 <w:szCs w:val="21"/>
               </w:rPr>
-              <w:t xml:space="preserve">+$640</w:t>
+              <w:t xml:space="preserve">+$830</w:t>
             </w:r>
           </w:p>
         </w:tc>
@@ -1922,7 +1922,7 @@
                 <w:sz w:val="21"/>
                 <w:szCs w:val="21"/>
               </w:rPr>
-              <w:t xml:space="preserve">+$445</w:t>
+              <w:t xml:space="preserve">+$575</w:t>
             </w:r>
           </w:p>
         </w:tc>
@@ -1954,7 +1954,7 @@
                 <w:sz w:val="21"/>
                 <w:szCs w:val="21"/>
               </w:rPr>
-              <w:t xml:space="preserve">−$1,095</w:t>
+              <w:t xml:space="preserve">−$1,430</w:t>
             </w:r>
           </w:p>
         </w:tc>
@@ -2033,7 +2033,7 @@
                 <w:sz w:val="21"/>
                 <w:szCs w:val="21"/>
               </w:rPr>
-              <w:t xml:space="preserve">$7,915</w:t>
+              <w:t xml:space="preserve">$10,290</w:t>
             </w:r>
           </w:p>
         </w:tc>
@@ -2066,7 +2066,7 @@
                 <w:sz w:val="21"/>
                 <w:szCs w:val="21"/>
               </w:rPr>
-              <w:t xml:space="preserve">+$1,735</w:t>
+              <w:t xml:space="preserve">+$2,260</w:t>
             </w:r>
           </w:p>
         </w:tc>
@@ -2099,7 +2099,7 @@
                 <w:sz w:val="21"/>
                 <w:szCs w:val="21"/>
               </w:rPr>
-              <w:t xml:space="preserve">+$1,095</w:t>
+              <w:t xml:space="preserve">+$1,430</w:t>
             </w:r>
           </w:p>
         </w:tc>

</xml_diff>

<commit_message>
Subir el margen al 55 % en las cotizaciones
Co-Authored-By: Claude Opus 5.5 <noreply@anthropic.com>
Claude-Session: https://claude.ai/code/session_0137o8WSxNvVuvENWjtHj8Xx
</commit_message>
<xml_diff>
--- a/cotizaciones/Estimate_Yellowstone_Club_Stone_Floor.docx
+++ b/cotizaciones/Estimate_Yellowstone_Club_Stone_Floor.docx
@@ -608,7 +608,7 @@
                 <w:sz w:val="24"/>
                 <w:szCs w:val="24"/>
               </w:rPr>
-              <w:t xml:space="preserve">$10,290</w:t>
+              <w:t xml:space="preserve">$11,430</w:t>
             </w:r>
           </w:p>
         </w:tc>
@@ -643,7 +643,7 @@
                 <w:sz w:val="21"/>
                 <w:szCs w:val="21"/>
               </w:rPr>
-              <w:t xml:space="preserve">+$2,260</w:t>
+              <w:t xml:space="preserve">+$2,510</w:t>
             </w:r>
           </w:p>
         </w:tc>
@@ -775,7 +775,7 @@
                 <w:sz w:val="24"/>
                 <w:szCs w:val="24"/>
               </w:rPr>
-              <w:t xml:space="preserve">$8,285</w:t>
+              <w:t xml:space="preserve">$9,205</w:t>
             </w:r>
           </w:p>
         </w:tc>
@@ -809,7 +809,7 @@
                 <w:sz w:val="21"/>
                 <w:szCs w:val="21"/>
               </w:rPr>
-              <w:t xml:space="preserve">+$255</w:t>
+              <w:t xml:space="preserve">+$285</w:t>
             </w:r>
           </w:p>
         </w:tc>
@@ -941,7 +941,7 @@
                 <w:sz w:val="24"/>
                 <w:szCs w:val="24"/>
               </w:rPr>
-              <w:t xml:space="preserve">$8,860</w:t>
+              <w:t xml:space="preserve">$9,845</w:t>
             </w:r>
           </w:p>
         </w:tc>
@@ -975,7 +975,7 @@
                 <w:sz w:val="21"/>
                 <w:szCs w:val="21"/>
               </w:rPr>
-              <w:t xml:space="preserve">+$830</w:t>
+              <w:t xml:space="preserve">+$925</w:t>
             </w:r>
           </w:p>
         </w:tc>
@@ -1107,7 +1107,7 @@
                 <w:sz w:val="24"/>
                 <w:szCs w:val="24"/>
               </w:rPr>
-              <w:t xml:space="preserve">$8,030</w:t>
+              <w:t xml:space="preserve">$8,920</w:t>
             </w:r>
           </w:p>
         </w:tc>
@@ -1202,7 +1202,7 @@
           <w:sz w:val="21"/>
           <w:szCs w:val="21"/>
         </w:rPr>
-        <w:t xml:space="preserve">$8,030 – $10,290. </w:t>
+        <w:t xml:space="preserve">$8,920 – $11,430. </w:t>
       </w:r>
       <w:r>
         <w:rPr>
@@ -1220,7 +1220,7 @@
           <w:sz w:val="21"/>
           <w:szCs w:val="21"/>
         </w:rPr>
-        <w:t xml:space="preserve">$2,260</w:t>
+        <w:t xml:space="preserve">$2,510</w:t>
       </w:r>
       <w:r>
         <w:rPr>
@@ -1507,7 +1507,7 @@
                 <w:sz w:val="21"/>
                 <w:szCs w:val="21"/>
               </w:rPr>
-              <w:t xml:space="preserve">$8,030</w:t>
+              <w:t xml:space="preserve">$8,920</w:t>
             </w:r>
           </w:p>
         </w:tc>
@@ -1603,7 +1603,7 @@
                 <w:sz w:val="21"/>
                 <w:szCs w:val="21"/>
               </w:rPr>
-              <w:t xml:space="preserve">−$2,260</w:t>
+              <w:t xml:space="preserve">−$2,510</w:t>
             </w:r>
           </w:p>
         </w:tc>
@@ -1682,7 +1682,7 @@
                 <w:sz w:val="21"/>
                 <w:szCs w:val="21"/>
               </w:rPr>
-              <w:t xml:space="preserve">$8,285</w:t>
+              <w:t xml:space="preserve">$9,205</w:t>
             </w:r>
           </w:p>
         </w:tc>
@@ -1715,7 +1715,7 @@
                 <w:sz w:val="21"/>
                 <w:szCs w:val="21"/>
               </w:rPr>
-              <w:t xml:space="preserve">+$255</w:t>
+              <w:t xml:space="preserve">+$285</w:t>
             </w:r>
           </w:p>
         </w:tc>
@@ -1748,7 +1748,7 @@
                 <w:sz w:val="21"/>
                 <w:szCs w:val="21"/>
               </w:rPr>
-              <w:t xml:space="preserve">+$255</w:t>
+              <w:t xml:space="preserve">+$285</w:t>
             </w:r>
           </w:p>
         </w:tc>
@@ -1781,7 +1781,7 @@
                 <w:sz w:val="21"/>
                 <w:szCs w:val="21"/>
               </w:rPr>
-              <w:t xml:space="preserve">−$2,005</w:t>
+              <w:t xml:space="preserve">−$2,225</w:t>
             </w:r>
           </w:p>
         </w:tc>
@@ -1858,7 +1858,7 @@
                 <w:sz w:val="21"/>
                 <w:szCs w:val="21"/>
               </w:rPr>
-              <w:t xml:space="preserve">$8,860</w:t>
+              <w:t xml:space="preserve">$9,845</w:t>
             </w:r>
           </w:p>
         </w:tc>
@@ -1890,7 +1890,7 @@
                 <w:sz w:val="21"/>
                 <w:szCs w:val="21"/>
               </w:rPr>
-              <w:t xml:space="preserve">+$830</w:t>
+              <w:t xml:space="preserve">+$925</w:t>
             </w:r>
           </w:p>
         </w:tc>
@@ -1922,7 +1922,7 @@
                 <w:sz w:val="21"/>
                 <w:szCs w:val="21"/>
               </w:rPr>
-              <w:t xml:space="preserve">+$575</w:t>
+              <w:t xml:space="preserve">+$640</w:t>
             </w:r>
           </w:p>
         </w:tc>
@@ -1954,7 +1954,7 @@
                 <w:sz w:val="21"/>
                 <w:szCs w:val="21"/>
               </w:rPr>
-              <w:t xml:space="preserve">−$1,430</w:t>
+              <w:t xml:space="preserve">−$1,585</w:t>
             </w:r>
           </w:p>
         </w:tc>
@@ -2033,7 +2033,7 @@
                 <w:sz w:val="21"/>
                 <w:szCs w:val="21"/>
               </w:rPr>
-              <w:t xml:space="preserve">$10,290</w:t>
+              <w:t xml:space="preserve">$11,430</w:t>
             </w:r>
           </w:p>
         </w:tc>
@@ -2066,7 +2066,7 @@
                 <w:sz w:val="21"/>
                 <w:szCs w:val="21"/>
               </w:rPr>
-              <w:t xml:space="preserve">+$2,260</w:t>
+              <w:t xml:space="preserve">+$2,510</w:t>
             </w:r>
           </w:p>
         </w:tc>
@@ -2099,7 +2099,7 @@
                 <w:sz w:val="21"/>
                 <w:szCs w:val="21"/>
               </w:rPr>
-              <w:t xml:space="preserve">+$1,430</w:t>
+              <w:t xml:space="preserve">+$1,585</w:t>
             </w:r>
           </w:p>
         </w:tc>

</xml_diff>